<commit_message>
Nettoyer et finaliser le projet EcoDrive
</commit_message>
<xml_diff>
--- a/projet fin d'etude/Cahier_des_charges_EcoDrive_corrige.docx
+++ b/projet fin d'etude/Cahier_des_charges_EcoDrive_corrige.docx
@@ -4,15 +4,11 @@
   <w:body>
     <w:p>
       <w:pPr>
-        <w:spacing w:before="2200" w:after="200"/>
-        <w:jc w:val="center"/>
-      </w:pPr>
-      <w:r>
-        <w:rPr>
-          <w:rFonts w:ascii="Aptos Display" w:hAnsi="Aptos Display"/>
-          <w:color w:val="17365D"/>
-          <w:sz w:val="56"/>
-        </w:rPr>
+        <w:pStyle w:val="Titre1"/>
+        <w:ind w:firstLine="709"/>
+        <w:jc w:val="both"/>
+      </w:pPr>
+      <w:r>
         <w:t>EcoDrive</w:t>
       </w:r>
     </w:p>
@@ -55,6 +51,51 @@
     </w:p>
     <w:p>
       <w:pPr>
+        <w:pBdr>
+          <w:bottom w:val="single" w:sz="18" w:space="1" w:color="00B37A"/>
+        </w:pBdr>
+        <w:spacing w:after="240"/>
+        <w:jc w:val="center"/>
+      </w:pPr>
+    </w:p>
+    <w:p>
+      <w:pPr>
+        <w:pBdr>
+          <w:bottom w:val="single" w:sz="18" w:space="1" w:color="00B37A"/>
+        </w:pBdr>
+        <w:spacing w:after="240"/>
+        <w:jc w:val="center"/>
+      </w:pPr>
+    </w:p>
+    <w:p>
+      <w:pPr>
+        <w:pBdr>
+          <w:bottom w:val="single" w:sz="18" w:space="1" w:color="00B37A"/>
+        </w:pBdr>
+        <w:spacing w:after="240"/>
+        <w:jc w:val="center"/>
+      </w:pPr>
+    </w:p>
+    <w:p>
+      <w:pPr>
+        <w:pBdr>
+          <w:bottom w:val="single" w:sz="18" w:space="1" w:color="00B37A"/>
+        </w:pBdr>
+        <w:spacing w:after="240"/>
+        <w:jc w:val="center"/>
+      </w:pPr>
+    </w:p>
+    <w:p>
+      <w:pPr>
+        <w:pBdr>
+          <w:bottom w:val="single" w:sz="18" w:space="1" w:color="00B37A"/>
+        </w:pBdr>
+        <w:spacing w:after="240"/>
+        <w:jc w:val="center"/>
+      </w:pPr>
+    </w:p>
+    <w:p>
+      <w:pPr>
         <w:spacing w:after="80"/>
         <w:jc w:val="center"/>
       </w:pPr>
@@ -69,8 +110,18 @@
       <w:pPr>
         <w:spacing w:after="80"/>
         <w:jc w:val="center"/>
-      </w:pPr>
-      <w:r>
+        <w:rPr>
+          <w:rFonts w:ascii="Arial" w:hAnsi="Arial" w:cs="Arial"/>
+          <w:sz w:val="28"/>
+          <w:szCs w:val="28"/>
+        </w:rPr>
+      </w:pPr>
+      <w:r>
+        <w:rPr>
+          <w:rFonts w:ascii="Arial" w:hAnsi="Arial" w:cs="Arial"/>
+          <w:sz w:val="28"/>
+          <w:szCs w:val="28"/>
+        </w:rPr>
         <w:t>BTS Informatique de gestion — ISPRI</w:t>
       </w:r>
     </w:p>
@@ -78,8 +129,18 @@
       <w:pPr>
         <w:spacing w:after="80"/>
         <w:jc w:val="center"/>
-      </w:pPr>
-      <w:r>
+        <w:rPr>
+          <w:rFonts w:ascii="Arial" w:hAnsi="Arial" w:cs="Arial"/>
+          <w:sz w:val="28"/>
+          <w:szCs w:val="28"/>
+        </w:rPr>
+      </w:pPr>
+      <w:r>
+        <w:rPr>
+          <w:rFonts w:ascii="Arial" w:hAnsi="Arial" w:cs="Arial"/>
+          <w:sz w:val="28"/>
+          <w:szCs w:val="28"/>
+        </w:rPr>
         <w:t>Projet de fin d’études — Session 2024-2026</w:t>
       </w:r>
     </w:p>
@@ -157,12 +218,36 @@
       </w:r>
     </w:p>
     <w:p>
-      <w:r>
+      <w:pPr>
+        <w:rPr>
+          <w:rFonts w:ascii="Arial" w:hAnsi="Arial" w:cs="Arial"/>
+          <w:sz w:val="28"/>
+          <w:szCs w:val="28"/>
+        </w:rPr>
+      </w:pPr>
+      <w:r>
+        <w:rPr>
+          <w:rFonts w:ascii="Arial" w:hAnsi="Arial" w:cs="Arial"/>
+          <w:sz w:val="28"/>
+          <w:szCs w:val="28"/>
+        </w:rPr>
         <w:t>EcoDrive est un site web vitrine et catalogue dédié à la commercialisation de véhicules électriques en Tunisie. Il permet au grand public de découvrir les modèles disponibles, de comparer leurs caractéristiques, de réserver un essai en concession et de consulter le réseau de bornes de recharge Exicom. L'application dispose d'un espace client (compte, historique d'essais) et d'un espace administrateur (gestion du catalogue, des réservations, des bornes, des utilisateurs et des statistiques).</w:t>
       </w:r>
     </w:p>
     <w:p>
-      <w:r>
+      <w:pPr>
+        <w:rPr>
+          <w:rFonts w:ascii="Arial" w:hAnsi="Arial" w:cs="Arial"/>
+          <w:sz w:val="28"/>
+          <w:szCs w:val="28"/>
+        </w:rPr>
+      </w:pPr>
+      <w:r>
+        <w:rPr>
+          <w:rFonts w:ascii="Arial" w:hAnsi="Arial" w:cs="Arial"/>
+          <w:sz w:val="28"/>
+          <w:szCs w:val="28"/>
+        </w:rPr>
         <w:t>L'objectif est de fournir une plateforme moderne, sécurisée, responsive et ergonomique, respectant une charte graphique sombre avec une accentuation en vert néon (#00E5A0).</w:t>
       </w:r>
     </w:p>
@@ -178,6 +263,23 @@
       <w:r>
         <w:lastRenderedPageBreak/>
         <w:t>2. Identification des acteurs</w:t>
+      </w:r>
+    </w:p>
+    <w:p>
+      <w:pPr>
+        <w:rPr>
+          <w:rFonts w:ascii="Arial" w:hAnsi="Arial" w:cs="Arial"/>
+          <w:sz w:val="28"/>
+          <w:szCs w:val="28"/>
+        </w:rPr>
+      </w:pPr>
+      <w:r>
+        <w:rPr>
+          <w:rFonts w:ascii="Arial" w:hAnsi="Arial" w:cs="Arial"/>
+          <w:sz w:val="28"/>
+          <w:szCs w:val="28"/>
+        </w:rPr>
+        <w:t>Visiteur : utilisateur non connecté. Consulte le showroom, le catalogue, les fiches techniques, les bornes et les pages statiques (contact, mentions légales, CGV, CGU, confidentialité) ; peut s'inscrire et s'authentifier.</w:t>
       </w:r>
     </w:p>
     <w:p>
@@ -186,9 +288,19 @@
           <w:ilvl w:val="0"/>
           <w:numId w:val="1"/>
         </w:numPr>
-      </w:pPr>
-      <w:r>
-        <w:t>Visiteur : utilisateur non connecté. Consulte le showroom, le catalogue, les fiches techniques, les bornes et les pages statiques (contact, mentions légales, CGV, CGU, confidentialité) ; peut s'inscrire et s'authentifier.</w:t>
+        <w:rPr>
+          <w:rFonts w:ascii="Arial" w:hAnsi="Arial" w:cs="Arial"/>
+          <w:sz w:val="28"/>
+          <w:szCs w:val="28"/>
+        </w:rPr>
+      </w:pPr>
+      <w:r>
+        <w:rPr>
+          <w:rFonts w:ascii="Arial" w:hAnsi="Arial" w:cs="Arial"/>
+          <w:sz w:val="28"/>
+          <w:szCs w:val="28"/>
+        </w:rPr>
+        <w:t>Client : utilisateur authentifié. En plus des droits du visiteur, réserve un essai, consulte son profil, modifie ses informations et consulte l'historique de ses essais.</w:t>
       </w:r>
     </w:p>
     <w:p>
@@ -197,19 +309,18 @@
           <w:ilvl w:val="0"/>
           <w:numId w:val="1"/>
         </w:numPr>
-      </w:pPr>
-      <w:r>
-        <w:t>Client : utilisateur authentifié. En plus des droits du visiteur, réserve un essai, consulte son profil, modifie ses informations et consulte l'historique de ses essais.</w:t>
-      </w:r>
-    </w:p>
-    <w:p>
-      <w:pPr>
-        <w:numPr>
-          <w:ilvl w:val="0"/>
-          <w:numId w:val="1"/>
-        </w:numPr>
-      </w:pPr>
-      <w:r>
+        <w:rPr>
+          <w:rFonts w:ascii="Arial" w:hAnsi="Arial" w:cs="Arial"/>
+          <w:sz w:val="28"/>
+          <w:szCs w:val="28"/>
+        </w:rPr>
+      </w:pPr>
+      <w:r>
+        <w:rPr>
+          <w:rFonts w:ascii="Arial" w:hAnsi="Arial" w:cs="Arial"/>
+          <w:sz w:val="28"/>
+          <w:szCs w:val="28"/>
+        </w:rPr>
         <w:t>Administrateur : gestionnaire du site. Dispose de tous les droits du client et, en plus, gère les voitures (CRUD + mise en avant), les bornes (CRUD), les réservations (confirmation, annulation), les messages de contact, la newsletter, les utilisateurs (rôles, suppression) et consulte les statistiques et le journal d'audit.</w:t>
       </w:r>
     </w:p>
@@ -236,8 +347,8 @@
         <w:tblLook w:val="04A0" w:firstRow="1" w:lastRow="0" w:firstColumn="1" w:lastColumn="0" w:noHBand="0" w:noVBand="1"/>
       </w:tblPr>
       <w:tblGrid>
-        <w:gridCol w:w="1520"/>
-        <w:gridCol w:w="7897"/>
+        <w:gridCol w:w="1503"/>
+        <w:gridCol w:w="7579"/>
       </w:tblGrid>
       <w:tr>
         <w:trPr>
@@ -954,7 +1065,7 @@
       </w:tblPr>
       <w:tblGrid>
         <w:gridCol w:w="933"/>
-        <w:gridCol w:w="8484"/>
+        <w:gridCol w:w="8149"/>
       </w:tblGrid>
       <w:tr>
         <w:trPr>
@@ -2085,8 +2196,9 @@
       <w:headerReference w:type="default" r:id="rId7"/>
       <w:footerReference w:type="default" r:id="rId8"/>
       <w:pgSz w:w="11906" w:h="16838"/>
-      <w:pgMar w:top="1247" w:right="1247" w:bottom="1134" w:left="1247" w:header="720" w:footer="720" w:gutter="0"/>
+      <w:pgMar w:top="1417" w:right="1417" w:bottom="1417" w:left="1417" w:header="720" w:footer="720" w:gutter="0"/>
       <w:cols w:space="720"/>
+      <w:docGrid w:linePitch="286"/>
     </w:sectPr>
   </w:body>
 </w:document>
@@ -2274,14 +2386,13 @@
   <w:docDefaults>
     <w:rPrDefault>
       <w:rPr>
-        <w:rFonts w:ascii="Calibri" w:eastAsia="Times New Roman" w:hAnsi="Calibri" w:cs="Times New Roman"/>
-        <w:sz w:val="22"/>
+        <w:rFonts w:asciiTheme="minorHAnsi" w:eastAsiaTheme="minorEastAsia" w:hAnsiTheme="minorHAnsi" w:cstheme="minorBidi"/>
         <w:lang w:val="fr-FR" w:eastAsia="fr-FR" w:bidi="ar-SA"/>
       </w:rPr>
     </w:rPrDefault>
     <w:pPrDefault>
       <w:pPr>
-        <w:spacing w:after="160" w:line="278" w:lineRule="auto"/>
+        <w:spacing w:before="100" w:after="200" w:line="276" w:lineRule="auto"/>
       </w:pPr>
     </w:pPrDefault>
   </w:docDefaults>
@@ -2666,53 +2777,215 @@
   <w:style w:type="paragraph" w:default="1" w:styleId="Normal">
     <w:name w:val="Normal"/>
     <w:qFormat/>
-    <w:pPr>
-      <w:spacing w:after="120" w:line="269" w:lineRule="auto"/>
-    </w:pPr>
-    <w:rPr>
-      <w:rFonts w:ascii="Aptos" w:hAnsi="Aptos"/>
-      <w:sz w:val="21"/>
-    </w:rPr>
+    <w:rsid w:val="00600651"/>
   </w:style>
   <w:style w:type="paragraph" w:styleId="Titre1">
     <w:name w:val="heading 1"/>
     <w:basedOn w:val="Normal"/>
     <w:next w:val="Normal"/>
+    <w:link w:val="Titre1Car"/>
     <w:uiPriority w:val="9"/>
     <w:qFormat/>
+    <w:rsid w:val="00600651"/>
     <w:pPr>
-      <w:keepNext/>
       <w:pBdr>
-        <w:bottom w:val="single" w:sz="6" w:space="4" w:color="CFFAF1"/>
+        <w:top w:val="single" w:sz="24" w:space="0" w:color="156082" w:themeColor="accent1"/>
+        <w:left w:val="single" w:sz="24" w:space="0" w:color="156082" w:themeColor="accent1"/>
+        <w:bottom w:val="single" w:sz="24" w:space="0" w:color="156082" w:themeColor="accent1"/>
+        <w:right w:val="single" w:sz="24" w:space="0" w:color="156082" w:themeColor="accent1"/>
       </w:pBdr>
-      <w:spacing w:before="320" w:after="140"/>
+      <w:shd w:val="clear" w:color="auto" w:fill="156082" w:themeFill="accent1"/>
+      <w:spacing w:after="0"/>
       <w:outlineLvl w:val="0"/>
     </w:pPr>
     <w:rPr>
-      <w:rFonts w:ascii="Aptos Display" w:hAnsi="Aptos Display"/>
-      <w:b/>
-      <w:color w:val="17365D"/>
-      <w:sz w:val="30"/>
+      <w:caps/>
+      <w:color w:val="FFFFFF" w:themeColor="background1"/>
+      <w:spacing w:val="15"/>
+      <w:sz w:val="22"/>
+      <w:szCs w:val="22"/>
     </w:rPr>
   </w:style>
   <w:style w:type="paragraph" w:styleId="Titre2">
     <w:name w:val="heading 2"/>
     <w:basedOn w:val="Normal"/>
     <w:next w:val="Normal"/>
+    <w:link w:val="Titre2Car"/>
     <w:uiPriority w:val="9"/>
     <w:semiHidden/>
     <w:unhideWhenUsed/>
     <w:qFormat/>
+    <w:rsid w:val="00600651"/>
     <w:pPr>
-      <w:keepNext/>
-      <w:spacing w:before="320" w:after="140"/>
+      <w:pBdr>
+        <w:top w:val="single" w:sz="24" w:space="0" w:color="C1E4F5" w:themeColor="accent1" w:themeTint="33"/>
+        <w:left w:val="single" w:sz="24" w:space="0" w:color="C1E4F5" w:themeColor="accent1" w:themeTint="33"/>
+        <w:bottom w:val="single" w:sz="24" w:space="0" w:color="C1E4F5" w:themeColor="accent1" w:themeTint="33"/>
+        <w:right w:val="single" w:sz="24" w:space="0" w:color="C1E4F5" w:themeColor="accent1" w:themeTint="33"/>
+      </w:pBdr>
+      <w:shd w:val="clear" w:color="auto" w:fill="C1E4F5" w:themeFill="accent1" w:themeFillTint="33"/>
+      <w:spacing w:after="0"/>
       <w:outlineLvl w:val="1"/>
     </w:pPr>
     <w:rPr>
-      <w:rFonts w:ascii="Aptos Display" w:hAnsi="Aptos Display"/>
-      <w:b/>
-      <w:color w:val="17365D"/>
-      <w:sz w:val="24"/>
+      <w:caps/>
+      <w:spacing w:val="15"/>
+    </w:rPr>
+  </w:style>
+  <w:style w:type="paragraph" w:styleId="Titre3">
+    <w:name w:val="heading 3"/>
+    <w:basedOn w:val="Normal"/>
+    <w:next w:val="Normal"/>
+    <w:link w:val="Titre3Car"/>
+    <w:uiPriority w:val="9"/>
+    <w:semiHidden/>
+    <w:unhideWhenUsed/>
+    <w:qFormat/>
+    <w:rsid w:val="00600651"/>
+    <w:pPr>
+      <w:pBdr>
+        <w:top w:val="single" w:sz="6" w:space="2" w:color="156082" w:themeColor="accent1"/>
+      </w:pBdr>
+      <w:spacing w:before="300" w:after="0"/>
+      <w:outlineLvl w:val="2"/>
+    </w:pPr>
+    <w:rPr>
+      <w:caps/>
+      <w:color w:val="0A2F40" w:themeColor="accent1" w:themeShade="7F"/>
+      <w:spacing w:val="15"/>
+    </w:rPr>
+  </w:style>
+  <w:style w:type="paragraph" w:styleId="Titre4">
+    <w:name w:val="heading 4"/>
+    <w:basedOn w:val="Normal"/>
+    <w:next w:val="Normal"/>
+    <w:link w:val="Titre4Car"/>
+    <w:uiPriority w:val="9"/>
+    <w:semiHidden/>
+    <w:unhideWhenUsed/>
+    <w:qFormat/>
+    <w:rsid w:val="00600651"/>
+    <w:pPr>
+      <w:pBdr>
+        <w:top w:val="dotted" w:sz="6" w:space="2" w:color="156082" w:themeColor="accent1"/>
+      </w:pBdr>
+      <w:spacing w:before="200" w:after="0"/>
+      <w:outlineLvl w:val="3"/>
+    </w:pPr>
+    <w:rPr>
+      <w:caps/>
+      <w:color w:val="0F4761" w:themeColor="accent1" w:themeShade="BF"/>
+      <w:spacing w:val="10"/>
+    </w:rPr>
+  </w:style>
+  <w:style w:type="paragraph" w:styleId="Titre5">
+    <w:name w:val="heading 5"/>
+    <w:basedOn w:val="Normal"/>
+    <w:next w:val="Normal"/>
+    <w:link w:val="Titre5Car"/>
+    <w:uiPriority w:val="9"/>
+    <w:semiHidden/>
+    <w:unhideWhenUsed/>
+    <w:qFormat/>
+    <w:rsid w:val="00600651"/>
+    <w:pPr>
+      <w:pBdr>
+        <w:bottom w:val="single" w:sz="6" w:space="1" w:color="156082" w:themeColor="accent1"/>
+      </w:pBdr>
+      <w:spacing w:before="200" w:after="0"/>
+      <w:outlineLvl w:val="4"/>
+    </w:pPr>
+    <w:rPr>
+      <w:caps/>
+      <w:color w:val="0F4761" w:themeColor="accent1" w:themeShade="BF"/>
+      <w:spacing w:val="10"/>
+    </w:rPr>
+  </w:style>
+  <w:style w:type="paragraph" w:styleId="Titre6">
+    <w:name w:val="heading 6"/>
+    <w:basedOn w:val="Normal"/>
+    <w:next w:val="Normal"/>
+    <w:link w:val="Titre6Car"/>
+    <w:uiPriority w:val="9"/>
+    <w:semiHidden/>
+    <w:unhideWhenUsed/>
+    <w:qFormat/>
+    <w:rsid w:val="00600651"/>
+    <w:pPr>
+      <w:pBdr>
+        <w:bottom w:val="dotted" w:sz="6" w:space="1" w:color="156082" w:themeColor="accent1"/>
+      </w:pBdr>
+      <w:spacing w:before="200" w:after="0"/>
+      <w:outlineLvl w:val="5"/>
+    </w:pPr>
+    <w:rPr>
+      <w:caps/>
+      <w:color w:val="0F4761" w:themeColor="accent1" w:themeShade="BF"/>
+      <w:spacing w:val="10"/>
+    </w:rPr>
+  </w:style>
+  <w:style w:type="paragraph" w:styleId="Titre7">
+    <w:name w:val="heading 7"/>
+    <w:basedOn w:val="Normal"/>
+    <w:next w:val="Normal"/>
+    <w:link w:val="Titre7Car"/>
+    <w:uiPriority w:val="9"/>
+    <w:semiHidden/>
+    <w:unhideWhenUsed/>
+    <w:qFormat/>
+    <w:rsid w:val="00600651"/>
+    <w:pPr>
+      <w:spacing w:before="200" w:after="0"/>
+      <w:outlineLvl w:val="6"/>
+    </w:pPr>
+    <w:rPr>
+      <w:caps/>
+      <w:color w:val="0F4761" w:themeColor="accent1" w:themeShade="BF"/>
+      <w:spacing w:val="10"/>
+    </w:rPr>
+  </w:style>
+  <w:style w:type="paragraph" w:styleId="Titre8">
+    <w:name w:val="heading 8"/>
+    <w:basedOn w:val="Normal"/>
+    <w:next w:val="Normal"/>
+    <w:link w:val="Titre8Car"/>
+    <w:uiPriority w:val="9"/>
+    <w:semiHidden/>
+    <w:unhideWhenUsed/>
+    <w:qFormat/>
+    <w:rsid w:val="00600651"/>
+    <w:pPr>
+      <w:spacing w:before="200" w:after="0"/>
+      <w:outlineLvl w:val="7"/>
+    </w:pPr>
+    <w:rPr>
+      <w:caps/>
+      <w:spacing w:val="10"/>
+      <w:sz w:val="18"/>
+      <w:szCs w:val="18"/>
+    </w:rPr>
+  </w:style>
+  <w:style w:type="paragraph" w:styleId="Titre9">
+    <w:name w:val="heading 9"/>
+    <w:basedOn w:val="Normal"/>
+    <w:next w:val="Normal"/>
+    <w:link w:val="Titre9Car"/>
+    <w:uiPriority w:val="9"/>
+    <w:semiHidden/>
+    <w:unhideWhenUsed/>
+    <w:qFormat/>
+    <w:rsid w:val="00600651"/>
+    <w:pPr>
+      <w:spacing w:before="200" w:after="0"/>
+      <w:outlineLvl w:val="8"/>
+    </w:pPr>
+    <w:rPr>
+      <w:i/>
+      <w:iCs/>
+      <w:caps/>
+      <w:spacing w:val="10"/>
+      <w:sz w:val="18"/>
+      <w:szCs w:val="18"/>
     </w:rPr>
   </w:style>
   <w:style w:type="character" w:default="1" w:styleId="Policepardfaut">
@@ -2760,6 +3033,378 @@
         <w:right w:w="0" w:type="dxa"/>
       </w:tblCellMar>
     </w:tblPr>
+  </w:style>
+  <w:style w:type="character" w:customStyle="1" w:styleId="Titre1Car">
+    <w:name w:val="Titre 1 Car"/>
+    <w:basedOn w:val="Policepardfaut"/>
+    <w:link w:val="Titre1"/>
+    <w:uiPriority w:val="9"/>
+    <w:rsid w:val="00600651"/>
+    <w:rPr>
+      <w:caps/>
+      <w:color w:val="FFFFFF" w:themeColor="background1"/>
+      <w:spacing w:val="15"/>
+      <w:sz w:val="22"/>
+      <w:szCs w:val="22"/>
+      <w:shd w:val="clear" w:color="auto" w:fill="156082" w:themeFill="accent1"/>
+    </w:rPr>
+  </w:style>
+  <w:style w:type="character" w:customStyle="1" w:styleId="Titre2Car">
+    <w:name w:val="Titre 2 Car"/>
+    <w:basedOn w:val="Policepardfaut"/>
+    <w:link w:val="Titre2"/>
+    <w:uiPriority w:val="9"/>
+    <w:semiHidden/>
+    <w:rsid w:val="00600651"/>
+    <w:rPr>
+      <w:caps/>
+      <w:spacing w:val="15"/>
+      <w:shd w:val="clear" w:color="auto" w:fill="C1E4F5" w:themeFill="accent1" w:themeFillTint="33"/>
+    </w:rPr>
+  </w:style>
+  <w:style w:type="character" w:customStyle="1" w:styleId="Titre3Car">
+    <w:name w:val="Titre 3 Car"/>
+    <w:basedOn w:val="Policepardfaut"/>
+    <w:link w:val="Titre3"/>
+    <w:uiPriority w:val="9"/>
+    <w:semiHidden/>
+    <w:rsid w:val="00600651"/>
+    <w:rPr>
+      <w:caps/>
+      <w:color w:val="0A2F40" w:themeColor="accent1" w:themeShade="7F"/>
+      <w:spacing w:val="15"/>
+    </w:rPr>
+  </w:style>
+  <w:style w:type="character" w:customStyle="1" w:styleId="Titre4Car">
+    <w:name w:val="Titre 4 Car"/>
+    <w:basedOn w:val="Policepardfaut"/>
+    <w:link w:val="Titre4"/>
+    <w:uiPriority w:val="9"/>
+    <w:semiHidden/>
+    <w:rsid w:val="00600651"/>
+    <w:rPr>
+      <w:caps/>
+      <w:color w:val="0F4761" w:themeColor="accent1" w:themeShade="BF"/>
+      <w:spacing w:val="10"/>
+    </w:rPr>
+  </w:style>
+  <w:style w:type="character" w:customStyle="1" w:styleId="Titre5Car">
+    <w:name w:val="Titre 5 Car"/>
+    <w:basedOn w:val="Policepardfaut"/>
+    <w:link w:val="Titre5"/>
+    <w:uiPriority w:val="9"/>
+    <w:semiHidden/>
+    <w:rsid w:val="00600651"/>
+    <w:rPr>
+      <w:caps/>
+      <w:color w:val="0F4761" w:themeColor="accent1" w:themeShade="BF"/>
+      <w:spacing w:val="10"/>
+    </w:rPr>
+  </w:style>
+  <w:style w:type="character" w:customStyle="1" w:styleId="Titre6Car">
+    <w:name w:val="Titre 6 Car"/>
+    <w:basedOn w:val="Policepardfaut"/>
+    <w:link w:val="Titre6"/>
+    <w:uiPriority w:val="9"/>
+    <w:semiHidden/>
+    <w:rsid w:val="00600651"/>
+    <w:rPr>
+      <w:caps/>
+      <w:color w:val="0F4761" w:themeColor="accent1" w:themeShade="BF"/>
+      <w:spacing w:val="10"/>
+    </w:rPr>
+  </w:style>
+  <w:style w:type="character" w:customStyle="1" w:styleId="Titre7Car">
+    <w:name w:val="Titre 7 Car"/>
+    <w:basedOn w:val="Policepardfaut"/>
+    <w:link w:val="Titre7"/>
+    <w:uiPriority w:val="9"/>
+    <w:semiHidden/>
+    <w:rsid w:val="00600651"/>
+    <w:rPr>
+      <w:caps/>
+      <w:color w:val="0F4761" w:themeColor="accent1" w:themeShade="BF"/>
+      <w:spacing w:val="10"/>
+    </w:rPr>
+  </w:style>
+  <w:style w:type="character" w:customStyle="1" w:styleId="Titre8Car">
+    <w:name w:val="Titre 8 Car"/>
+    <w:basedOn w:val="Policepardfaut"/>
+    <w:link w:val="Titre8"/>
+    <w:uiPriority w:val="9"/>
+    <w:semiHidden/>
+    <w:rsid w:val="00600651"/>
+    <w:rPr>
+      <w:caps/>
+      <w:spacing w:val="10"/>
+      <w:sz w:val="18"/>
+      <w:szCs w:val="18"/>
+    </w:rPr>
+  </w:style>
+  <w:style w:type="character" w:customStyle="1" w:styleId="Titre9Car">
+    <w:name w:val="Titre 9 Car"/>
+    <w:basedOn w:val="Policepardfaut"/>
+    <w:link w:val="Titre9"/>
+    <w:uiPriority w:val="9"/>
+    <w:semiHidden/>
+    <w:rsid w:val="00600651"/>
+    <w:rPr>
+      <w:i/>
+      <w:iCs/>
+      <w:caps/>
+      <w:spacing w:val="10"/>
+      <w:sz w:val="18"/>
+      <w:szCs w:val="18"/>
+    </w:rPr>
+  </w:style>
+  <w:style w:type="paragraph" w:styleId="Lgende">
+    <w:name w:val="caption"/>
+    <w:basedOn w:val="Normal"/>
+    <w:next w:val="Normal"/>
+    <w:uiPriority w:val="35"/>
+    <w:semiHidden/>
+    <w:unhideWhenUsed/>
+    <w:qFormat/>
+    <w:rsid w:val="00600651"/>
+    <w:rPr>
+      <w:b/>
+      <w:bCs/>
+      <w:color w:val="0F4761" w:themeColor="accent1" w:themeShade="BF"/>
+      <w:sz w:val="16"/>
+      <w:szCs w:val="16"/>
+    </w:rPr>
+  </w:style>
+  <w:style w:type="paragraph" w:styleId="Titre">
+    <w:name w:val="Title"/>
+    <w:basedOn w:val="Normal"/>
+    <w:next w:val="Normal"/>
+    <w:link w:val="TitreCar"/>
+    <w:uiPriority w:val="10"/>
+    <w:qFormat/>
+    <w:rsid w:val="00600651"/>
+    <w:pPr>
+      <w:spacing w:before="0" w:after="0"/>
+    </w:pPr>
+    <w:rPr>
+      <w:rFonts w:asciiTheme="majorHAnsi" w:eastAsiaTheme="majorEastAsia" w:hAnsiTheme="majorHAnsi" w:cstheme="majorBidi"/>
+      <w:caps/>
+      <w:color w:val="156082" w:themeColor="accent1"/>
+      <w:spacing w:val="10"/>
+      <w:sz w:val="52"/>
+      <w:szCs w:val="52"/>
+    </w:rPr>
+  </w:style>
+  <w:style w:type="character" w:customStyle="1" w:styleId="TitreCar">
+    <w:name w:val="Titre Car"/>
+    <w:basedOn w:val="Policepardfaut"/>
+    <w:link w:val="Titre"/>
+    <w:uiPriority w:val="10"/>
+    <w:rsid w:val="00600651"/>
+    <w:rPr>
+      <w:rFonts w:asciiTheme="majorHAnsi" w:eastAsiaTheme="majorEastAsia" w:hAnsiTheme="majorHAnsi" w:cstheme="majorBidi"/>
+      <w:caps/>
+      <w:color w:val="156082" w:themeColor="accent1"/>
+      <w:spacing w:val="10"/>
+      <w:sz w:val="52"/>
+      <w:szCs w:val="52"/>
+    </w:rPr>
+  </w:style>
+  <w:style w:type="paragraph" w:styleId="Sous-titre">
+    <w:name w:val="Subtitle"/>
+    <w:basedOn w:val="Normal"/>
+    <w:next w:val="Normal"/>
+    <w:link w:val="Sous-titreCar"/>
+    <w:uiPriority w:val="11"/>
+    <w:qFormat/>
+    <w:rsid w:val="00600651"/>
+    <w:pPr>
+      <w:spacing w:before="0" w:after="500" w:line="240" w:lineRule="auto"/>
+    </w:pPr>
+    <w:rPr>
+      <w:caps/>
+      <w:color w:val="595959" w:themeColor="text1" w:themeTint="A6"/>
+      <w:spacing w:val="10"/>
+      <w:sz w:val="21"/>
+      <w:szCs w:val="21"/>
+    </w:rPr>
+  </w:style>
+  <w:style w:type="character" w:customStyle="1" w:styleId="Sous-titreCar">
+    <w:name w:val="Sous-titre Car"/>
+    <w:basedOn w:val="Policepardfaut"/>
+    <w:link w:val="Sous-titre"/>
+    <w:uiPriority w:val="11"/>
+    <w:rsid w:val="00600651"/>
+    <w:rPr>
+      <w:caps/>
+      <w:color w:val="595959" w:themeColor="text1" w:themeTint="A6"/>
+      <w:spacing w:val="10"/>
+      <w:sz w:val="21"/>
+      <w:szCs w:val="21"/>
+    </w:rPr>
+  </w:style>
+  <w:style w:type="character" w:styleId="lev">
+    <w:name w:val="Strong"/>
+    <w:uiPriority w:val="22"/>
+    <w:qFormat/>
+    <w:rsid w:val="00600651"/>
+    <w:rPr>
+      <w:b/>
+      <w:bCs/>
+    </w:rPr>
+  </w:style>
+  <w:style w:type="character" w:styleId="Accentuation">
+    <w:name w:val="Emphasis"/>
+    <w:uiPriority w:val="20"/>
+    <w:qFormat/>
+    <w:rsid w:val="00600651"/>
+    <w:rPr>
+      <w:caps/>
+      <w:color w:val="0A2F40" w:themeColor="accent1" w:themeShade="7F"/>
+      <w:spacing w:val="5"/>
+    </w:rPr>
+  </w:style>
+  <w:style w:type="paragraph" w:styleId="Sansinterligne">
+    <w:name w:val="No Spacing"/>
+    <w:uiPriority w:val="1"/>
+    <w:qFormat/>
+    <w:rsid w:val="00600651"/>
+    <w:pPr>
+      <w:spacing w:after="0" w:line="240" w:lineRule="auto"/>
+    </w:pPr>
+  </w:style>
+  <w:style w:type="paragraph" w:styleId="Citation">
+    <w:name w:val="Quote"/>
+    <w:basedOn w:val="Normal"/>
+    <w:next w:val="Normal"/>
+    <w:link w:val="CitationCar"/>
+    <w:uiPriority w:val="29"/>
+    <w:qFormat/>
+    <w:rsid w:val="00600651"/>
+    <w:rPr>
+      <w:i/>
+      <w:iCs/>
+      <w:sz w:val="24"/>
+      <w:szCs w:val="24"/>
+    </w:rPr>
+  </w:style>
+  <w:style w:type="character" w:customStyle="1" w:styleId="CitationCar">
+    <w:name w:val="Citation Car"/>
+    <w:basedOn w:val="Policepardfaut"/>
+    <w:link w:val="Citation"/>
+    <w:uiPriority w:val="29"/>
+    <w:rsid w:val="00600651"/>
+    <w:rPr>
+      <w:i/>
+      <w:iCs/>
+      <w:sz w:val="24"/>
+      <w:szCs w:val="24"/>
+    </w:rPr>
+  </w:style>
+  <w:style w:type="paragraph" w:styleId="Citationintense">
+    <w:name w:val="Intense Quote"/>
+    <w:basedOn w:val="Normal"/>
+    <w:next w:val="Normal"/>
+    <w:link w:val="CitationintenseCar"/>
+    <w:uiPriority w:val="30"/>
+    <w:qFormat/>
+    <w:rsid w:val="00600651"/>
+    <w:pPr>
+      <w:spacing w:before="240" w:after="240" w:line="240" w:lineRule="auto"/>
+      <w:ind w:left="1080" w:right="1080"/>
+      <w:jc w:val="center"/>
+    </w:pPr>
+    <w:rPr>
+      <w:color w:val="156082" w:themeColor="accent1"/>
+      <w:sz w:val="24"/>
+      <w:szCs w:val="24"/>
+    </w:rPr>
+  </w:style>
+  <w:style w:type="character" w:customStyle="1" w:styleId="CitationintenseCar">
+    <w:name w:val="Citation intense Car"/>
+    <w:basedOn w:val="Policepardfaut"/>
+    <w:link w:val="Citationintense"/>
+    <w:uiPriority w:val="30"/>
+    <w:rsid w:val="00600651"/>
+    <w:rPr>
+      <w:color w:val="156082" w:themeColor="accent1"/>
+      <w:sz w:val="24"/>
+      <w:szCs w:val="24"/>
+    </w:rPr>
+  </w:style>
+  <w:style w:type="character" w:styleId="Accentuationlgre">
+    <w:name w:val="Subtle Emphasis"/>
+    <w:uiPriority w:val="19"/>
+    <w:qFormat/>
+    <w:rsid w:val="00600651"/>
+    <w:rPr>
+      <w:i/>
+      <w:iCs/>
+      <w:color w:val="0A2F40" w:themeColor="accent1" w:themeShade="7F"/>
+    </w:rPr>
+  </w:style>
+  <w:style w:type="character" w:styleId="Accentuationintense">
+    <w:name w:val="Intense Emphasis"/>
+    <w:uiPriority w:val="21"/>
+    <w:qFormat/>
+    <w:rsid w:val="00600651"/>
+    <w:rPr>
+      <w:b/>
+      <w:bCs/>
+      <w:caps/>
+      <w:color w:val="0A2F40" w:themeColor="accent1" w:themeShade="7F"/>
+      <w:spacing w:val="10"/>
+    </w:rPr>
+  </w:style>
+  <w:style w:type="character" w:styleId="Rfrencelgre">
+    <w:name w:val="Subtle Reference"/>
+    <w:uiPriority w:val="31"/>
+    <w:qFormat/>
+    <w:rsid w:val="00600651"/>
+    <w:rPr>
+      <w:b/>
+      <w:bCs/>
+      <w:color w:val="156082" w:themeColor="accent1"/>
+    </w:rPr>
+  </w:style>
+  <w:style w:type="character" w:styleId="Rfrenceintense">
+    <w:name w:val="Intense Reference"/>
+    <w:uiPriority w:val="32"/>
+    <w:qFormat/>
+    <w:rsid w:val="00600651"/>
+    <w:rPr>
+      <w:b/>
+      <w:bCs/>
+      <w:i/>
+      <w:iCs/>
+      <w:caps/>
+      <w:color w:val="156082" w:themeColor="accent1"/>
+    </w:rPr>
+  </w:style>
+  <w:style w:type="character" w:styleId="Titredulivre">
+    <w:name w:val="Book Title"/>
+    <w:uiPriority w:val="33"/>
+    <w:qFormat/>
+    <w:rsid w:val="00600651"/>
+    <w:rPr>
+      <w:b/>
+      <w:bCs/>
+      <w:i/>
+      <w:iCs/>
+      <w:spacing w:val="0"/>
+    </w:rPr>
+  </w:style>
+  <w:style w:type="paragraph" w:styleId="En-ttedetabledesmatires">
+    <w:name w:val="TOC Heading"/>
+    <w:basedOn w:val="Titre1"/>
+    <w:next w:val="Normal"/>
+    <w:uiPriority w:val="39"/>
+    <w:semiHidden/>
+    <w:unhideWhenUsed/>
+    <w:qFormat/>
+    <w:rsid w:val="00600651"/>
+    <w:pPr>
+      <w:outlineLvl w:val="9"/>
+    </w:pPr>
   </w:style>
 </w:styles>
 </file>

</xml_diff>